<commit_message>
Revise rulebook to clarify questions
</commit_message>
<xml_diff>
--- a/HOPE_AI_Challenge_2026_Rules_EN.docx
+++ b/HOPE_AI_Challenge_2026_Rules_EN.docx
@@ -15,7 +15,7 @@
           <w:sz w:val="32"/>
           <w:szCs w:val="32"/>
         </w:rPr>
-        <w:t xml:space="preserve">10. Ping-Pong Autonomous Decision-Making Event (HOPE AI Challenge)</w:t>
+        <w:t xml:space="preserve">2nd World Humanoid Robot Games — Hitch Open Ping-Pong Embodied (HOPE) AI Challenge Rulebook</w:t>
       </w:r>
     </w:p>
     <w:p>
@@ -47,7 +47,7 @@
           <w:sz w:val="22"/>
           <w:szCs w:val="22"/>
         </w:rPr>
-        <w:t xml:space="preserve">The official GitHub repository of the HOPE Reference System is https://github.com/hitchopen/HOPE (hereinafter the "HOPE GitHub Repository"). The standard motion-capture system configuration defined in the repository is hereinafter referred to as the "HOPE Standard Motion-Capture System". The repository contains the complete motion-capture configuration scripts, ROS 2 topic definitions, coordinate-frame calibration procedures, a reference planner and example WBC training code. The repository is updated as the event evolves; participating teams shall use the latest released version as of 30 days before the competition as the authoritative reference.</w:t>
+        <w:t xml:space="preserve">The official GitHub repository of the HOPE Reference System is https://github.com/hitchopen/HOPE (hereinafter the "HOPE GitHub Repository"). The standard motion-capture system configuration defined in the repository is hereinafter referred to as the "HOPE Standard Motion-Capture System". The repository contains the complete motion-capture configuration scripts, ROS 2 topic definitions, coordinate-frame calibration procedures, a reference planner and example WBC training code. The repository is updated as the event evolves; participating teams shall use the latest released version as the authoritative reference.</w:t>
       </w:r>
     </w:p>
     <w:p>
@@ -79,7 +79,7 @@
           <w:sz w:val="22"/>
           <w:szCs w:val="22"/>
         </w:rPr>
-        <w:t xml:space="preserve">This chapter contains two categories of rules: (i) robot-vs-robot 1V1 matches between humanoid robots (§10.1 through §10.6), and (ii) an exhibition match between the Robot Champion and a human professional table-tennis player (§10.7). Both categories impose the same requirements on the robot hardware, so the same robot that wins the Robot Champion title can take part in the exhibition match without any modification. Terminology convention: in this chapter, "the Event Committee", "the Committee" and "the Organizing Committee" (without the "Games" prefix) all refer to the Event Committee of this event and are equivalent; "the Games Organizing Committee" specifically refers to the Organizing Committee of the 2nd World Humanoid Robot Games, whose relationship with the Event Committee is described in §10.8.</w:t>
+        <w:t xml:space="preserve">This chapter contains two categories of rules: (i) robot-vs-robot 1V1 matches between humanoid robots (§1 through §6), and (ii) an exhibition match between the Robot Champion and a human professional table-tennis player (§7). Both categories impose the same requirements on the robot hardware, so the same robot that wins the Robot Champion title can take part in the exhibition match without any modification. Terminology convention: in this chapter, "the Event Committee", "the Committee" and "the Organizing Committee" (without the "Games" prefix) all refer to the Event Committee of this event and are equivalent; "the Games Organizing Committee" specifically refers to the Organizing Committee of the 2nd World Humanoid Robot Games, whose relationship with the Event Committee is described in §8.</w:t>
       </w:r>
     </w:p>
     <w:p>
@@ -96,7 +96,7 @@
           <w:sz w:val="28"/>
           <w:szCs w:val="28"/>
         </w:rPr>
-        <w:t xml:space="preserve">10.1 Team Requirements</w:t>
+        <w:t xml:space="preserve">1 Team Requirements</w:t>
       </w:r>
     </w:p>
     <w:p>
@@ -176,7 +176,7 @@
           <w:sz w:val="22"/>
           <w:szCs w:val="22"/>
         </w:rPr>
-        <w:t xml:space="preserve">(5) Regardless of internal implementation, the robot must satisfy the hardware and safety requirements listed in §10.2 and be fully compatible with the HOPE Standard Motion-Capture System configuration provided by the HOPE GitHub Repository (see §10.5.4).</w:t>
+        <w:t xml:space="preserve">(5) Regardless of internal implementation, the robot must satisfy the hardware and safety requirements listed in §2 and be fully compatible with the HOPE Standard Motion-Capture System configuration provided by the HOPE GitHub Repository (see §5.4).</w:t>
       </w:r>
     </w:p>
     <w:p>
@@ -193,7 +193,7 @@
           <w:sz w:val="25"/>
           <w:szCs w:val="25"/>
         </w:rPr>
-        <w:t xml:space="preserve">10.1.1 Qualification Demonstration Video (Mandatory)</w:t>
+        <w:t xml:space="preserve">1.1 Qualification Demonstration Video (Mandatory)</w:t>
       </w:r>
     </w:p>
     <w:p>
@@ -455,7 +455,7 @@
                 <w:sz w:val="20"/>
                 <w:szCs w:val="20"/>
               </w:rPr>
-              <w:t xml:space="preserve">The robot completes 3 consecutive stable serves (ball must clear the net and first land in the valid area of the opposite half-table)</w:t>
+              <w:t xml:space="preserve">The robot completes 3 consecutive stable serves (a legal service must first touch the server's own half once, then go over or around the net assembly and land in the valid area of the receiver's half-table; service legality is judged per §5.2(3))</w:t>
             </w:r>
           </w:p>
         </w:tc>
@@ -752,23 +752,23 @@
           <w:sz w:val="28"/>
           <w:szCs w:val="28"/>
         </w:rPr>
-        <w:t xml:space="preserve">10.2 Robot Requirements</w:t>
-      </w:r>
-    </w:p>
-    <w:p>
-      <w:pPr>
-        <w:spacing w:after="60" w:before="60" w:line="320" w:lineRule="auto"/>
-        <w:jc w:val="both"/>
-      </w:pPr>
-      <w:r>
-        <w:rPr>
-          <w:rFonts w:ascii="Calibri" w:cs="Calibri" w:eastAsia="Calibri" w:hAnsi="Calibri"/>
-          <w:b w:val="false"/>
-          <w:bCs w:val="false"/>
-          <w:sz w:val="22"/>
-          <w:szCs w:val="22"/>
-        </w:rPr>
-        <w:t xml:space="preserve">The robot requirements listed in this section apply both to the robot-vs-robot matches in §10.3–§10.6 and to the robot-vs-human exhibition match in §10.7. The Robot Champion may compete in the exhibition match without any modification.</w:t>
+        <w:t xml:space="preserve">2 Robot Requirements</w:t>
+      </w:r>
+    </w:p>
+    <w:p>
+      <w:pPr>
+        <w:spacing w:after="60" w:before="60" w:line="320" w:lineRule="auto"/>
+        <w:jc w:val="both"/>
+      </w:pPr>
+      <w:r>
+        <w:rPr>
+          <w:rFonts w:ascii="Calibri" w:cs="Calibri" w:eastAsia="Calibri" w:hAnsi="Calibri"/>
+          <w:b w:val="false"/>
+          <w:bCs w:val="false"/>
+          <w:sz w:val="22"/>
+          <w:szCs w:val="22"/>
+        </w:rPr>
+        <w:t xml:space="preserve">The robot requirements listed in this section apply both to the robot-vs-robot matches in §3–§6 and to the robot-vs-human exhibition match in §7. The Robot Champion may compete in the exhibition match without any modification.</w:t>
       </w:r>
     </w:p>
     <w:p>
@@ -864,23 +864,23 @@
           <w:sz w:val="22"/>
           <w:szCs w:val="22"/>
         </w:rPr>
-        <w:t xml:space="preserve">(6) Safety device. The robot must be equipped with a clearly marked emergency-stop button that can be triggered with a single hand by an on-court team member or an on-site referee; once triggered, the robot must immediately stop all motion, or go limp / cut power to the actuators. Apart from the emergency-stop button and the power switch, the robot may have at most two additional, clearly labelled physical buttons for starting and stopping match behaviour. The robot shell shall not contain sharp edges, exposed hot parts, or protrusions that may snag clothing; for robot-vs-human matches, the robot must additionally pass the pre-match safety inspection (see §10.7.4). The unified emergency-stop response requirement and its pre-match test method are given in §10.5.5(9).</w:t>
-      </w:r>
-    </w:p>
-    <w:p>
-      <w:pPr>
-        <w:spacing w:after="60" w:before="60" w:line="320" w:lineRule="auto"/>
-        <w:jc w:val="both"/>
-      </w:pPr>
-      <w:r>
-        <w:rPr>
-          <w:rFonts w:ascii="Calibri" w:cs="Calibri" w:eastAsia="Calibri" w:hAnsi="Calibri"/>
-          <w:b w:val="false"/>
-          <w:bCs w:val="false"/>
-          <w:sz w:val="22"/>
-          <w:szCs w:val="22"/>
-        </w:rPr>
-        <w:t xml:space="preserve">(7) Racket. The racket must comply with ITTF Laws of Table Tennis §2.4: the blade must be flat and rigid. For ordinary pimpled rubber (pips outward), the total thickness including adhesive shall not exceed 2 mm; for sandwich rubber, the total thickness including adhesive shall not exceed 4 mm. The two sides of the racket must have clearly different colours as required by ITTF §2.4.6 (any ITTF-approved standard rubber is acceptable); both the blade and the rubber must be currently ITTF-approved equipment. It is strictly prohibited to attach any motion-capture retro-reflective marker or other active tracking device to the racket, grip or wrist (see §10.5.4).</w:t>
+        <w:t xml:space="preserve">(6) Safety device. The robot must be equipped with a clearly marked emergency-stop button that can be triggered with a single hand by an on-court team member or an on-site referee; once triggered, the robot must immediately stop all motion, or go limp / cut power to the actuators. Apart from the emergency-stop button and the power switch, the robot may have at most two additional, clearly labelled physical buttons for starting and stopping match behaviour. The robot shell shall not contain sharp edges, exposed hot parts, or protrusions that may snag clothing; for robot-vs-human matches, the robot must additionally pass the pre-match safety inspection (see §7.4). The unified emergency-stop response requirement and its pre-match test method are given in §5.5(9).</w:t>
+      </w:r>
+    </w:p>
+    <w:p>
+      <w:pPr>
+        <w:spacing w:after="60" w:before="60" w:line="320" w:lineRule="auto"/>
+        <w:jc w:val="both"/>
+      </w:pPr>
+      <w:r>
+        <w:rPr>
+          <w:rFonts w:ascii="Calibri" w:cs="Calibri" w:eastAsia="Calibri" w:hAnsi="Calibri"/>
+          <w:b w:val="false"/>
+          <w:bCs w:val="false"/>
+          <w:sz w:val="22"/>
+          <w:szCs w:val="22"/>
+        </w:rPr>
+        <w:t xml:space="preserve">(7) Racket. The racket must comply with ITTF Laws of Table Tennis §2.4: the blade must be flat and rigid. For ordinary pimpled rubber (pips outward), the total thickness including adhesive shall not exceed 2 mm; for sandwich rubber, the total thickness including adhesive shall not exceed 4 mm. The two sides of the racket must have clearly different colours as required by ITTF §2.4.6 (any ITTF-approved standard rubber is acceptable); both the blade and the rubber must be currently ITTF-approved equipment. It is strictly prohibited to attach any motion-capture retro-reflective marker or other active tracking device to the racket, grip or wrist (see §5.4).</w:t>
       </w:r>
     </w:p>
     <w:p>
@@ -929,7 +929,7 @@
           <w:sz w:val="28"/>
           <w:szCs w:val="28"/>
         </w:rPr>
-        <w:t xml:space="preserve">10.3 Competition Content</w:t>
+        <w:t xml:space="preserve">3 Competition Content</w:t>
       </w:r>
     </w:p>
     <w:p>
@@ -961,39 +961,39 @@
           <w:sz w:val="22"/>
           <w:szCs w:val="22"/>
         </w:rPr>
-        <w:t xml:space="preserve">(1) Humanoid robot 1V1 table-tennis match (robot-vs-robot match — the official competition). Two robots stand at the two ends of the ping-pong table and compete in singles under §10.5 of this chapter and the current ITTF rules. The match is performed entirely autonomously by the robots, and the "Robot Champion" of the event is determined.</w:t>
-      </w:r>
-    </w:p>
-    <w:p>
-      <w:pPr>
-        <w:spacing w:after="60" w:before="60" w:line="320" w:lineRule="auto"/>
-        <w:jc w:val="both"/>
-      </w:pPr>
-      <w:r>
-        <w:rPr>
-          <w:rFonts w:ascii="Calibri" w:cs="Calibri" w:eastAsia="Calibri" w:hAnsi="Calibri"/>
-          <w:b w:val="false"/>
-          <w:bCs w:val="false"/>
-          <w:sz w:val="22"/>
-          <w:szCs w:val="22"/>
-        </w:rPr>
-        <w:t xml:space="preserve">(2) Robot Champion vs. human professional player exhibition match (robot-vs-human exhibition — single game). The Robot Champion plays a single-game exhibition match against a professional table-tennis player invited by the Organizing Committee. Rules are detailed in §10.7.</w:t>
-      </w:r>
-    </w:p>
-    <w:p>
-      <w:pPr>
-        <w:spacing w:after="60" w:before="60" w:line="320" w:lineRule="auto"/>
-        <w:jc w:val="both"/>
-      </w:pPr>
-      <w:r>
-        <w:rPr>
-          <w:rFonts w:ascii="Calibri" w:cs="Calibri" w:eastAsia="Calibri" w:hAnsi="Calibri"/>
-          <w:b w:val="false"/>
-          <w:bCs w:val="false"/>
-          <w:sz w:val="22"/>
-          <w:szCs w:val="22"/>
-        </w:rPr>
-        <w:t xml:space="preserve">Because only one standard competition court is set up at the event, the robot-vs-robot tournament is organized as a Single-Elimination Knockout when multiple teams take part. The order of matchups is determined by an open draw conducted by the Organizing Committee before the event (see §10.6). The Event Committee reserves the right, where it does not compromise fairness, to adjust the number of games per match and the score cap per game in light of the number of registrations, and to clarify specific rules on site before the match.</w:t>
+        <w:t xml:space="preserve">(1) Humanoid robot 1V1 table-tennis match (robot-vs-robot match — the official competition). Two robots stand at the two ends of the ping-pong table and compete in singles under §5 of this chapter and the current ITTF rules. The match is performed entirely autonomously by the robots, and the "Robot Champion" of the event is determined.</w:t>
+      </w:r>
+    </w:p>
+    <w:p>
+      <w:pPr>
+        <w:spacing w:after="60" w:before="60" w:line="320" w:lineRule="auto"/>
+        <w:jc w:val="both"/>
+      </w:pPr>
+      <w:r>
+        <w:rPr>
+          <w:rFonts w:ascii="Calibri" w:cs="Calibri" w:eastAsia="Calibri" w:hAnsi="Calibri"/>
+          <w:b w:val="false"/>
+          <w:bCs w:val="false"/>
+          <w:sz w:val="22"/>
+          <w:szCs w:val="22"/>
+        </w:rPr>
+        <w:t xml:space="preserve">(2) Robot Champion vs. human professional player exhibition match (robot-vs-human exhibition — single game). The Robot Champion plays a single-game exhibition match against a professional table-tennis player invited by the Organizing Committee. Rules are detailed in §7.</w:t>
+      </w:r>
+    </w:p>
+    <w:p>
+      <w:pPr>
+        <w:spacing w:after="60" w:before="60" w:line="320" w:lineRule="auto"/>
+        <w:jc w:val="both"/>
+      </w:pPr>
+      <w:r>
+        <w:rPr>
+          <w:rFonts w:ascii="Calibri" w:cs="Calibri" w:eastAsia="Calibri" w:hAnsi="Calibri"/>
+          <w:b w:val="false"/>
+          <w:bCs w:val="false"/>
+          <w:sz w:val="22"/>
+          <w:szCs w:val="22"/>
+        </w:rPr>
+        <w:t xml:space="preserve">Because only one standard competition court is set up at the event, the robot-vs-robot tournament is organized as a Single-Elimination Knockout when multiple teams take part. The order of matchups is determined by an open draw conducted by the Organizing Committee before the event (see §6). The Event Committee reserves the right, where it does not compromise fairness, to adjust the number of games per match and the score cap per game in light of the number of registrations, and to clarify specific rules on site before the match.</w:t>
       </w:r>
     </w:p>
     <w:p>
@@ -1010,7 +1010,7 @@
           <w:sz w:val="28"/>
           <w:szCs w:val="28"/>
         </w:rPr>
-        <w:t xml:space="preserve">10.4 Competition Venue</w:t>
+        <w:t xml:space="preserve">4 Competition Venue</w:t>
       </w:r>
     </w:p>
     <w:p>
@@ -1074,7 +1074,7 @@
           <w:sz w:val="22"/>
           <w:szCs w:val="22"/>
         </w:rPr>
-        <w:t xml:space="preserve">(4) Motion-capture system: At least 6 motion-capture cameras (8–12 recommended) are installed around the venue, covering the entire table and the 1.5 m buffer zone at each end. The camera frame rate must be no lower than 120 Hz; 240–360 Hz is recommended for stable tracking of high-speed balls.</w:t>
+        <w:t xml:space="preserve">(4) Motion-capture system: At least 6 motion-capture cameras (8–12 recommended) are installed around the venue, covering the entire table and the 1.5 m buffer zone at each end. The camera frame rate must be no lower than 120 Hz; 240–360 Hz is recommended for stable tracking of high-speed balls. The motion-capture system shall provide an effective tracking volume of no less than 6 m (length) × 5 m (width) × 3 m (height).</w:t>
       </w:r>
     </w:p>
     <w:p>
@@ -1123,7 +1123,7 @@
           <w:sz w:val="28"/>
           <w:szCs w:val="28"/>
         </w:rPr>
-        <w:t xml:space="preserve">10.5 Match Rules</w:t>
+        <w:t xml:space="preserve">5 Match Rules</w:t>
       </w:r>
     </w:p>
     <w:p>
@@ -1140,7 +1140,7 @@
           <w:sz w:val="25"/>
           <w:szCs w:val="25"/>
         </w:rPr>
-        <w:t xml:space="preserve">10.5.1 Match Flow</w:t>
+        <w:t xml:space="preserve">5.1 Match Flow</w:t>
       </w:r>
     </w:p>
     <w:p>
@@ -1188,7 +1188,7 @@
           <w:sz w:val="22"/>
           <w:szCs w:val="22"/>
         </w:rPr>
-        <w:t xml:space="preserve">(2) Opening commands. Before each game the umpire successively issues the four-stage commands initial → ready → set → go. The robot must autonomously take its position within 15 s after "ready", enter a static "ready-to-serve" state within 5 s after "set", and begin play at "go".</w:t>
+        <w:t xml:space="preserve">(2) Opening commands. For each rally (point), the umpire issues a three-step command sequence — "Ready", "Set" and "Go". Step 1: the umpire issues the "Ready" command; during the "Ready" phase, team members may manually assist the position and posture of their own robot; if either side's robot is not ready within 15 s after the "Ready" command, the umpire may impose an appropriate penalty (including directly awarding the loss of 1 point). Step 2: after confirming that both sides are ready, the umpire issues the "Set" command; the receiving robot enters the ready-to-receive state and immediately begins play, while the serving robot enters the ready-to-serve state and a member of the serving team hands the ball to the robot's serving hand (left or right) according to the team's serving strategy; if either side's robot fails to enter the above state within 10 s after the "Set" command, the umpire may impose an appropriate penalty (including directly awarding the loss of 1 point). Step 3: the umpire issues the "Go" command to the serving side; the serving robot must complete the service within 10 s after the "Go" command and immediately enter play; if the serving robot fails to serve within 10 s after the "Go" command, or the service fails (including human error by the serving team member), the umpire directly awards the loss of 1 point to the serving side and 1 point to the receiving side.</w:t>
       </w:r>
     </w:p>
     <w:p>
@@ -1285,7 +1285,7 @@
           <w:sz w:val="25"/>
           <w:szCs w:val="25"/>
         </w:rPr>
-        <w:t xml:space="preserve">10.5.2 Service Rules</w:t>
+        <w:t xml:space="preserve">5.2 Service Rules</w:t>
       </w:r>
     </w:p>
     <w:p>
@@ -1381,7 +1381,7 @@
           <w:sz w:val="22"/>
           <w:szCs w:val="22"/>
         </w:rPr>
-        <w:t xml:space="preserve">(5) Service tempo (10-second rule). At the start of each point, once the serving robot has gained control of the ball, the robot must complete the service motion within 10 seconds. Failure to complete a valid service within 10 s is a service fault and the opponent is awarded 1 point (see the penalty table in §10.5.6). The 10-second clock starts on the umpire's "go" command for the first point of each game, and on the umpire's signal of "may serve" or upon the service ball being placed on / handed to the serving robot for all subsequent points.</w:t>
+        <w:t xml:space="preserve">(5) Service tempo (10-second rule). At the start of each point, once the serving robot has gained control of the ball, the robot must complete the service motion within 10 seconds. Failure to complete a valid service within 10 s is a service fault and the opponent is awarded 1 point (see the penalty table in §5.6). The 10-second clock starts on the umpire's "go" command for the first point of each game, and on the umpire's signal of "may serve" or upon the service ball being placed on / handed to the serving robot for all subsequent points.</w:t>
       </w:r>
     </w:p>
     <w:p>
@@ -1398,6 +1398,22 @@
           <w:szCs w:val="22"/>
         </w:rPr>
         <w:t xml:space="preserve">(6) The robot may use any humanoid-biomimetic service technique (forehand, backhand, backspin, sidespin, topspin, etc.) that complies with the service requirements above. However, mechanical ball launchers, pneumatic devices or any other auxiliary serving device external to the robot body are strictly prohibited.</w:t>
+      </w:r>
+    </w:p>
+    <w:p>
+      <w:pPr>
+        <w:spacing w:after="60" w:before="60" w:line="320" w:lineRule="auto"/>
+        <w:jc w:val="both"/>
+      </w:pPr>
+      <w:r>
+        <w:rPr>
+          <w:rFonts w:ascii="Calibri" w:cs="Calibri" w:eastAsia="Calibri" w:hAnsi="Calibri"/>
+          <w:b w:val="false"/>
+          <w:bCs w:val="false"/>
+          <w:sz w:val="22"/>
+          <w:szCs w:val="22"/>
+        </w:rPr>
+        <w:t xml:space="preserve">(7) Ball supply for service. Before each point, an on-court member of the serving team hands or places the match ball onto the serving robot's body (the ball-holding structure of either the racket hand or the non-racket hand). Once the ball has been delivered and the umpire signals "may serve", the 10-second clock of clause (5) of this section begins, and the robot must autonomously perform the toss and the strike. Apart from this ball-supply action, team members must not intervene in the service in any other way.</w:t>
       </w:r>
     </w:p>
     <w:p>
@@ -1414,7 +1430,7 @@
           <w:sz w:val="25"/>
           <w:szCs w:val="25"/>
         </w:rPr>
-        <w:t xml:space="preserve">10.5.3 Rally and Scoring Rules</w:t>
+        <w:t xml:space="preserve">5.3 Rally and Scoring Rules</w:t>
       </w:r>
     </w:p>
     <w:p>
@@ -1527,7 +1543,7 @@
           <w:sz w:val="25"/>
           <w:szCs w:val="25"/>
         </w:rPr>
-        <w:t xml:space="preserve">10.5.4 Communication and System Integration (Mandatory)</w:t>
+        <w:t xml:space="preserve">5.4 Communication and System Integration (Mandatory)</w:t>
       </w:r>
     </w:p>
     <w:p>
@@ -1559,7 +1575,7 @@
           <w:sz w:val="22"/>
           <w:szCs w:val="22"/>
         </w:rPr>
-        <w:t xml:space="preserve">(1) Communication medium. The Organizing Committee deploys a unified wired / wireless network in the venue. The robot and its master computer may communicate only via the network provided by the Organizing Committee, and only with the HOPE Standard Motion-Capture System and the refereeing system; any team-private external wireless device is prohibited. If a participating robot actively disconnects or loses the above communication during a match for reasons other than a fault of the Organizing Committee's facilities, the corresponding penalty in the §10.5.6 table applies; if the loss is caused by a fault of the Organizing Committee's facilities, the situation is handled per §10.5.5(7).</w:t>
+        <w:t xml:space="preserve">(1) Communication medium. The Organizing Committee deploys a unified wired / wireless network in the venue. The robot and its master computer may communicate only via the network provided by the Organizing Committee, and only with the HOPE Standard Motion-Capture System and the refereeing system; any team-private external wireless device is prohibited. If a participating robot actively disconnects or loses the above communication during a match for reasons other than a fault of the Organizing Committee's facilities, the corresponding penalty in the §5.6 table applies; if the loss is caused by a fault of the Organizing Committee's facilities, the situation is handled per §5.5(7).</w:t>
       </w:r>
     </w:p>
     <w:p>
@@ -2227,23 +2243,23 @@
           <w:sz w:val="22"/>
           <w:szCs w:val="22"/>
         </w:rPr>
-        <w:t xml:space="preserve">(6) Coordinate convention. All poses published by the HOPE Standard Motion-Capture System are expressed in the ROS 2 REP 103 world frame defined in §10.4. To obtain its own base_link pose, the robot may either subscribe to /tf from the HOPE system and forward / re-use the published base_link pose, or independently estimate its own base_link pose (e.g., via SLAM or visual odometry). If the robot uses its own state estimation, the published pose must remain consistent with the HOPE world frame defined in this section. The robot shall publish its own base_link pose in this world frame on the HOPE-standard ROS 2 network (so that the TF chain integrity can be verified). The internal TF chain (from base_link to the end-effector racket) need not be disclosed.</w:t>
-      </w:r>
-    </w:p>
-    <w:p>
-      <w:pPr>
-        <w:spacing w:after="60" w:before="60" w:line="320" w:lineRule="auto"/>
-        <w:jc w:val="both"/>
-      </w:pPr>
-      <w:r>
-        <w:rPr>
-          <w:rFonts w:ascii="Calibri" w:cs="Calibri" w:eastAsia="Calibri" w:hAnsi="Calibri"/>
-          <w:b w:val="false"/>
-          <w:bCs w:val="false"/>
-          <w:sz w:val="22"/>
-          <w:szCs w:val="22"/>
-        </w:rPr>
-        <w:t xml:space="preserve">(7) The racket is not tracked. The HOPE Reference System explicitly specifies that the motion-capture system does not track the racket. The robot must infer the racket pose using its own proprioception and control system. It is strictly prohibited to attach any retro-reflective marker or active tracking device to the racket, the wrist or the grip (a hard requirement already given in §10.2(7)).</w:t>
+        <w:t xml:space="preserve">(6) Coordinate convention. All poses published by the HOPE Standard Motion-Capture System are expressed in the ROS 2 REP 103 world frame defined in §4. To obtain its own base_link pose, the robot may either subscribe to /tf from the HOPE system and forward / re-use the published base_link pose, or independently estimate its own base_link pose (e.g., via SLAM or visual odometry). If the robot uses its own state estimation, the published pose must remain consistent with the HOPE world frame defined in this section. The robot shall publish its own base_link pose in this world frame on the HOPE-standard ROS 2 network (so that the TF chain integrity can be verified). The internal TF chain (from base_link to the end-effector racket) need not be disclosed.</w:t>
+      </w:r>
+    </w:p>
+    <w:p>
+      <w:pPr>
+        <w:spacing w:after="60" w:before="60" w:line="320" w:lineRule="auto"/>
+        <w:jc w:val="both"/>
+      </w:pPr>
+      <w:r>
+        <w:rPr>
+          <w:rFonts w:ascii="Calibri" w:cs="Calibri" w:eastAsia="Calibri" w:hAnsi="Calibri"/>
+          <w:b w:val="false"/>
+          <w:bCs w:val="false"/>
+          <w:sz w:val="22"/>
+          <w:szCs w:val="22"/>
+        </w:rPr>
+        <w:t xml:space="preserve">(7) The racket is not tracked. The HOPE Reference System explicitly specifies that the motion-capture system does not track the racket. The robot must infer the racket pose using its own proprioception and control system. It is strictly prohibited to attach any retro-reflective marker or active tracking device to the racket, the wrist or the grip (a hard requirement already given in §2(7)).</w:t>
       </w:r>
     </w:p>
     <w:p>
@@ -2260,6 +2276,22 @@
           <w:szCs w:val="22"/>
         </w:rPr>
         <w:t xml:space="preserve">(8) Pre-match integration test. 30 minutes before each official match the robot must be connected to the Organizing Committee's motion-capture network. The technical referee verifies, via logs and RViz, that the robot can stably receive /poses, /tf and the other key motion-capture topics, with single-message latency not exceeding 30 ms at the 99th percentile. The integration test verifies only the robot's externally observable subscription and publishing behaviour; it does not inspect the robot's internal code or model. A robot that fails the integration test is not allowed into the competition area.</w:t>
+      </w:r>
+    </w:p>
+    <w:p>
+      <w:pPr>
+        <w:spacing w:after="60" w:before="60" w:line="320" w:lineRule="auto"/>
+        <w:jc w:val="both"/>
+      </w:pPr>
+      <w:r>
+        <w:rPr>
+          <w:rFonts w:ascii="Calibri" w:cs="Calibri" w:eastAsia="Calibri" w:hAnsi="Calibri"/>
+          <w:b w:val="false"/>
+          <w:bCs w:val="false"/>
+          <w:sz w:val="22"/>
+          <w:szCs w:val="22"/>
+        </w:rPr>
+        <w:t xml:space="preserve">(9) 3D data noise and denoising responsibility. Through on-site setup, calibration and masking, the Organizing Committee will make its best effort to reduce the venue's 3D data noise to the lowest level technically feasible; however, it does NOT guarantee that background noise points (outliers) are absent from the motion-capture output. The ping-pong ball point cloud and all target poses provided to the teams by the HOPE Standard Motion-Capture System are the raw data captured by the motion-capture system; for fairness, the Organizing Committee treats all teams identically and performs NO further filtering or post-processing of this data. After receiving the information describing the ping-pong ball point cloud, each team must decide for itself whether to apply motion-model-based filtering and denoising; any post-processing of the data captured by the motion-capture system is for each team to decide and implement on its own.</w:t>
       </w:r>
     </w:p>
     <w:p>
@@ -2276,23 +2308,23 @@
           <w:sz w:val="25"/>
           <w:szCs w:val="25"/>
         </w:rPr>
-        <w:t xml:space="preserve">10.5.5 Safety and On-Site Handling</w:t>
-      </w:r>
-    </w:p>
-    <w:p>
-      <w:pPr>
-        <w:spacing w:after="60" w:before="60" w:line="320" w:lineRule="auto"/>
-        <w:jc w:val="both"/>
-      </w:pPr>
-      <w:r>
-        <w:rPr>
-          <w:rFonts w:ascii="Calibri" w:cs="Calibri" w:eastAsia="Calibri" w:hAnsi="Calibri"/>
-          <w:b w:val="false"/>
-          <w:bCs w:val="false"/>
-          <w:sz w:val="22"/>
-          <w:szCs w:val="22"/>
-        </w:rPr>
-        <w:t xml:space="preserve">(1) Hard restrictions during a game. From the umpire's "go" command to the end of the game, it is forbidden to change any software configuration of the robot (including, without limitation, parameters, policy, model weights, control frequency, etc.), forbidden to change the robot's battery, and forbidden to perform any hardware replacement, repair, mounting, dismounting or debugging on the robot. Any such operation may be performed only during the pre-match preparation or inter-game break specified in §10.5.1. Violation of this clause loses the game; for repeated offences additional penalties under §10.5.7 or disqualification from the match apply.</w:t>
+        <w:t xml:space="preserve">5.5 Safety and On-Site Handling</w:t>
+      </w:r>
+    </w:p>
+    <w:p>
+      <w:pPr>
+        <w:spacing w:after="60" w:before="60" w:line="320" w:lineRule="auto"/>
+        <w:jc w:val="both"/>
+      </w:pPr>
+      <w:r>
+        <w:rPr>
+          <w:rFonts w:ascii="Calibri" w:cs="Calibri" w:eastAsia="Calibri" w:hAnsi="Calibri"/>
+          <w:b w:val="false"/>
+          <w:bCs w:val="false"/>
+          <w:sz w:val="22"/>
+          <w:szCs w:val="22"/>
+        </w:rPr>
+        <w:t xml:space="preserve">(1) Hard restrictions during a game. From the umpire's "go" command to the end of the game, it is forbidden to change any software configuration of the robot (including, without limitation, parameters, policy, model weights, control frequency, etc.), forbidden to change the robot's battery, and forbidden to perform any hardware replacement, repair, mounting, dismounting or debugging on the robot. Any such operation may be performed only during the pre-match preparation or inter-game break specified in §5.1. Violation of this clause loses the game; for repeated offences additional penalties under §5.7 or disqualification from the match apply.</w:t>
       </w:r>
     </w:p>
     <w:p>
@@ -2340,7 +2372,7 @@
           <w:sz w:val="22"/>
           <w:szCs w:val="22"/>
         </w:rPr>
-        <w:t xml:space="preserve">(4) Forfeit after three consecutive rallies. If the robot fails to enter play in 3 consecutive rallies (counting the rallies for which the per-60-s stacked penalties above were assessed), the game is forfeited (i.e. the opponent wins the game). Once the forfeit is declared, the game immediately ends and the next inter-game break under §10.5.1(7) begins. Example: the robot falls and cannot recover within 60 s — lose 1 point (counted as the 1st failed rally); the next rally begins but the robot again fails to respond to the service command, and after another 60 s — lose the 2nd point; a third such occurrence — after losing the 3rd point, the robot has failed 3 consecutive rallies in total, and the opponent wins the game.</w:t>
+        <w:t xml:space="preserve">(4) Forfeit after three consecutive rallies. If the robot fails to enter play in 3 consecutive rallies (counting the rallies for which the per-60-s stacked penalties above were assessed), the game is forfeited (i.e. the opponent wins the game). Once the forfeit is declared, the game immediately ends and the next inter-game break under §5.1(7) begins. Example: the robot falls and cannot recover within 60 s — lose 1 point (counted as the 1st failed rally); the next rally begins but the robot again fails to respond to the service command, and after another 60 s — lose the 2nd point; a third such occurrence — after losing the 3rd point, the robot has failed 3 consecutive rallies in total, and the opponent wins the game.</w:t>
       </w:r>
     </w:p>
     <w:p>
@@ -2404,23 +2436,23 @@
           <w:sz w:val="22"/>
           <w:szCs w:val="22"/>
         </w:rPr>
-        <w:t xml:space="preserve">(8) External interference. Teams are forbidden to maliciously interfere with another team's robot, with the motion-capture system or with the refereeing system in any way. Violations are dealt with under Chapters 3 and 4 of the General Participation Rules and under the penalty table in §10.5.6; in severe cases the team is disqualified from the event.</w:t>
-      </w:r>
-    </w:p>
-    <w:p>
-      <w:pPr>
-        <w:spacing w:after="60" w:before="60" w:line="320" w:lineRule="auto"/>
-        <w:jc w:val="both"/>
-      </w:pPr>
-      <w:r>
-        <w:rPr>
-          <w:rFonts w:ascii="Calibri" w:cs="Calibri" w:eastAsia="Calibri" w:hAnsi="Calibri"/>
-          <w:b w:val="false"/>
-          <w:bCs w:val="false"/>
-          <w:sz w:val="22"/>
-          <w:szCs w:val="22"/>
-        </w:rPr>
-        <w:t xml:space="preserve">(9) Emergency-stop response (unified rule — applies to both robot-vs-robot matches and the robot-vs-human exhibition match). Once an on-court team member (at most 2 per team) or any on-site referee presses the robot's emergency-stop button, the robot must stop all upper-limb and gait motion within 200 ms. The human player is NOT responsible for issuing the emergency-stop command; if the chief umpire blows the whistle to suspend play, the on-court team members must promptly press the emergency-stop button of their own robot. During the pre-match preparation time of every match (see §10.5.1(1)), the on-duty referee uses a referee stopwatch to measure the time from button trigger to full motion arrest, and decides whether the robot meets the 200 ms emergency-stop response requirement; a robot that fails the test is not allowed into the competition area for that match. On-site video and the robot's internal logs may serve as auxiliary evidence for response-time disputes.</w:t>
+        <w:t xml:space="preserve">(8) External interference. Teams are forbidden to maliciously interfere with another team's robot, with the motion-capture system or with the refereeing system in any way. Violations are dealt with under Chapters 3 and 4 of the General Participation Rules and under the penalty table in §5.6; in severe cases the team is disqualified from the event.</w:t>
+      </w:r>
+    </w:p>
+    <w:p>
+      <w:pPr>
+        <w:spacing w:after="60" w:before="60" w:line="320" w:lineRule="auto"/>
+        <w:jc w:val="both"/>
+      </w:pPr>
+      <w:r>
+        <w:rPr>
+          <w:rFonts w:ascii="Calibri" w:cs="Calibri" w:eastAsia="Calibri" w:hAnsi="Calibri"/>
+          <w:b w:val="false"/>
+          <w:bCs w:val="false"/>
+          <w:sz w:val="22"/>
+          <w:szCs w:val="22"/>
+        </w:rPr>
+        <w:t xml:space="preserve">(9) Emergency-stop response (unified rule — applies to both robot-vs-robot matches and the robot-vs-human exhibition match). Once an on-court team member (at most 2 per team) or any on-site referee presses the robot's emergency-stop button, the robot must stop all upper-limb and gait motion within 200 ms. The human player is NOT responsible for issuing the emergency-stop command; if the chief umpire blows the whistle to suspend play, the on-court team members must promptly press the emergency-stop button of their own robot. During the pre-match preparation time of every match (see §5.1(1)), the on-duty referee uses a referee stopwatch to measure the time from button trigger to full motion arrest, and decides whether the robot meets the 200 ms emergency-stop response requirement; a robot that fails the test is not allowed into the competition area for that match. On-site video and the robot's internal logs may serve as auxiliary evidence for response-time disputes.</w:t>
       </w:r>
     </w:p>
     <w:p>
@@ -2437,7 +2469,7 @@
           <w:sz w:val="25"/>
           <w:szCs w:val="25"/>
         </w:rPr>
-        <w:t xml:space="preserve">10.5.6 Violations and Penalties</w:t>
+        <w:t xml:space="preserve">5.6 Violations and Penalties</w:t>
       </w:r>
     </w:p>
     <w:p>
@@ -2784,7 +2816,7 @@
                 <w:sz w:val="20"/>
                 <w:szCs w:val="20"/>
               </w:rPr>
-              <w:t xml:space="preserve">See the 10-second rule in §10.5.2</w:t>
+              <w:t xml:space="preserve">See the 10-second rule in §5.2</w:t>
             </w:r>
           </w:p>
         </w:tc>
@@ -2992,7 +3024,7 @@
                 <w:sz w:val="20"/>
                 <w:szCs w:val="20"/>
               </w:rPr>
-              <w:t xml:space="preserve">See §10.5.1</w:t>
+              <w:t xml:space="preserve">See §5.1</w:t>
             </w:r>
           </w:p>
         </w:tc>
@@ -3063,7 +3095,7 @@
                 <w:sz w:val="20"/>
                 <w:szCs w:val="20"/>
               </w:rPr>
-              <w:t xml:space="preserve">Suspend the match for 60 s and penalize per the fall-recovery rules below (see §10.5.5(2)–(4))</w:t>
+              <w:t xml:space="preserve">Suspend the match for 60 s and penalize per the fall-recovery rules below (see §5.5(2)–(4))</w:t>
             </w:r>
           </w:p>
         </w:tc>
@@ -3200,7 +3232,7 @@
                 <w:sz w:val="20"/>
                 <w:szCs w:val="20"/>
               </w:rPr>
-              <w:t xml:space="preserve">See §10.5.5(3)</w:t>
+              <w:t xml:space="preserve">See §5.5(3)</w:t>
             </w:r>
           </w:p>
         </w:tc>
@@ -3408,7 +3440,7 @@
                 <w:sz w:val="20"/>
                 <w:szCs w:val="20"/>
               </w:rPr>
-              <w:t xml:space="preserve">See §10.5.5(4)</w:t>
+              <w:t xml:space="preserve">See §5.5(4)</w:t>
             </w:r>
           </w:p>
         </w:tc>
@@ -3512,7 +3544,7 @@
                 <w:sz w:val="20"/>
                 <w:szCs w:val="20"/>
               </w:rPr>
-              <w:t xml:space="preserve">See §10.5.5</w:t>
+              <w:t xml:space="preserve">See §5.5</w:t>
             </w:r>
           </w:p>
         </w:tc>
@@ -3668,23 +3700,23 @@
           <w:sz w:val="25"/>
           <w:szCs w:val="25"/>
         </w:rPr>
-        <w:t xml:space="preserve">10.5.7 Yellow and Red Cards (per the ITTF Unified Rules)</w:t>
-      </w:r>
-    </w:p>
-    <w:p>
-      <w:pPr>
-        <w:spacing w:after="60" w:before="60" w:line="320" w:lineRule="auto"/>
-        <w:jc w:val="both"/>
-      </w:pPr>
-      <w:r>
-        <w:rPr>
-          <w:rFonts w:ascii="Calibri" w:cs="Calibri" w:eastAsia="Calibri" w:hAnsi="Calibri"/>
-          <w:b w:val="false"/>
-          <w:bCs w:val="false"/>
-          <w:sz w:val="22"/>
-          <w:szCs w:val="22"/>
-        </w:rPr>
-        <w:t xml:space="preserve">Apart from the violations whose specific point penalties are directly stated in the §10.5.6 penalty table, all "yellow-card warnings" mentioned elsewhere in this chapter and the resulting stacked penalties are uniformly governed by ITTF Handbook §3.5.2 (Misbehaviour, located in the Regulations for International Competitions). The clauses below specify how this is applied in this event:</w:t>
+        <w:t xml:space="preserve">5.7 Yellow and Red Cards (per the ITTF Unified Rules)</w:t>
+      </w:r>
+    </w:p>
+    <w:p>
+      <w:pPr>
+        <w:spacing w:after="60" w:before="60" w:line="320" w:lineRule="auto"/>
+        <w:jc w:val="both"/>
+      </w:pPr>
+      <w:r>
+        <w:rPr>
+          <w:rFonts w:ascii="Calibri" w:cs="Calibri" w:eastAsia="Calibri" w:hAnsi="Calibri"/>
+          <w:b w:val="false"/>
+          <w:bCs w:val="false"/>
+          <w:sz w:val="22"/>
+          <w:szCs w:val="22"/>
+        </w:rPr>
+        <w:t xml:space="preserve">Apart from the violations whose specific point penalties are directly stated in the §5.6 penalty table, all "yellow-card warnings" mentioned elsewhere in this chapter and the resulting stacked penalties are uniformly governed by ITTF Handbook §3.5.2 (Misbehaviour, located in the Regulations for International Competitions). The clauses below specify how this is applied in this event:</w:t>
       </w:r>
     </w:p>
     <w:p>
@@ -3780,7 +3812,7 @@
           <w:sz w:val="22"/>
           <w:szCs w:val="22"/>
         </w:rPr>
-        <w:t xml:space="preserve">(6) Accumulation and reset. Yellow and red cards accumulate only within the same match; counts reset to zero at the start of the next match. However, the independent penalties stated in the §10.5.6 penalty table — loss of the game, forfeit of the game, disqualification from the match, etc. — are not subject to this stacking mechanism and are imposed by the umpire directly when the violation occurs.</w:t>
+        <w:t xml:space="preserve">(6) Accumulation and reset. Yellow and red cards accumulate only within the same match; counts reset to zero at the start of the next match. However, the independent penalties stated in the §5.6 penalty table — loss of the game, forfeit of the game, disqualification from the match, etc. — are not subject to this stacking mechanism and are imposed by the umpire directly when the violation occurs.</w:t>
       </w:r>
     </w:p>
     <w:p>
@@ -3812,7 +3844,7 @@
           <w:sz w:val="22"/>
           <w:szCs w:val="22"/>
         </w:rPr>
-        <w:t xml:space="preserve">(8) Relation to technical/tactical point penalties. The technical and tactical violations listed in the §10.5.6 penalty table (such as service faults, the 10-second timeout, fall-recovery penalties, etc.) are awarded as direct point penalties per the table and do NOT count toward the yellow/red card escalation in this section. Yellow and red cards in this section apply only to disciplinary misconduct (such as on-court members exceeding the operator zone, improper protest of an umpire's decision, the robot producing unnecessary motion while under a static-state command, etc.). The two penalty mechanisms are applied independently and do not substitute for or offset each other.</w:t>
+        <w:t xml:space="preserve">(8) Relation to technical/tactical point penalties. The technical and tactical violations listed in the §5.6 penalty table (such as service faults, the 10-second timeout, fall-recovery penalties, etc.) are awarded as direct point penalties per the table and do NOT count toward the yellow/red card escalation in this section. Yellow and red cards in this section apply only to disciplinary misconduct (such as on-court members exceeding the operator zone, improper protest of an umpire's decision, the robot producing unnecessary motion while under a static-state command, etc.). The two penalty mechanisms are applied independently and do not substitute for or offset each other.</w:t>
       </w:r>
     </w:p>
     <w:p>
@@ -3829,7 +3861,7 @@
           <w:sz w:val="28"/>
           <w:szCs w:val="28"/>
         </w:rPr>
-        <w:t xml:space="preserve">10.6 Match Results (Robot-vs-Robot)</w:t>
+        <w:t xml:space="preserve">6 Match Results (Robot-vs-Robot)</w:t>
       </w:r>
     </w:p>
     <w:p>
@@ -3862,39 +3894,39 @@
           <w:sz w:val="25"/>
           <w:szCs w:val="25"/>
         </w:rPr>
-        <w:t xml:space="preserve">10.6.1 Draw and Bracket</w:t>
-      </w:r>
-    </w:p>
-    <w:p>
-      <w:pPr>
-        <w:spacing w:after="60" w:before="60" w:line="320" w:lineRule="auto"/>
-        <w:jc w:val="both"/>
-      </w:pPr>
-      <w:r>
-        <w:rPr>
-          <w:rFonts w:ascii="Calibri" w:cs="Calibri" w:eastAsia="Calibri" w:hAnsi="Calibri"/>
-          <w:b w:val="false"/>
-          <w:bCs w:val="false"/>
-          <w:sz w:val="22"/>
-          <w:szCs w:val="22"/>
-        </w:rPr>
-        <w:t xml:space="preserve">(1) All teams that have passed the qualification-video review of §10.1.1 take part in a public draw conducted by the Organizing Committee within 24 hours before the start of on-site play at the 2nd World Humanoid Robot Games, to determine the knockout bracket positions and the order of play. The draw results are disclosed on the spot and cannot be changed.</w:t>
-      </w:r>
-    </w:p>
-    <w:p>
-      <w:pPr>
-        <w:spacing w:after="60" w:before="60" w:line="320" w:lineRule="auto"/>
-        <w:jc w:val="both"/>
-      </w:pPr>
-      <w:r>
-        <w:rPr>
-          <w:rFonts w:ascii="Calibri" w:cs="Calibri" w:eastAsia="Calibri" w:hAnsi="Calibri"/>
-          <w:b w:val="false"/>
-          <w:bCs w:val="false"/>
-          <w:sz w:val="22"/>
-          <w:szCs w:val="22"/>
-        </w:rPr>
-        <w:t xml:space="preserve">(2) The draw is fully random; there are no seeds and no preferential treatment based on registration order or video score. The only exception is that, if the total number N of teams is not a power of 2, the draw also determines which bracket positions receive a first-round bye, and the bye teams advance directly to the next round. A first-round bye merely gives the team a walk-over in the first round; it carries the same advancement rights in the bracket as a team that wins its first-round match, and the team plays normally in subsequent rounds. If a bye team is eliminated in the first round it actually plays, its final ranking is determined per §10.6.4(1) on a par with the other teams eliminated in that round.</w:t>
+        <w:t xml:space="preserve">6.1 Draw and Bracket</w:t>
+      </w:r>
+    </w:p>
+    <w:p>
+      <w:pPr>
+        <w:spacing w:after="60" w:before="60" w:line="320" w:lineRule="auto"/>
+        <w:jc w:val="both"/>
+      </w:pPr>
+      <w:r>
+        <w:rPr>
+          <w:rFonts w:ascii="Calibri" w:cs="Calibri" w:eastAsia="Calibri" w:hAnsi="Calibri"/>
+          <w:b w:val="false"/>
+          <w:bCs w:val="false"/>
+          <w:sz w:val="22"/>
+          <w:szCs w:val="22"/>
+        </w:rPr>
+        <w:t xml:space="preserve">(1) All teams that have passed the qualification-video review of §1.1 take part in a public draw conducted by the Organizing Committee within 24 hours before the start of on-site play at the 2nd World Humanoid Robot Games, to determine the knockout bracket positions and the order of play. The draw results are disclosed on the spot and cannot be changed.</w:t>
+      </w:r>
+    </w:p>
+    <w:p>
+      <w:pPr>
+        <w:spacing w:after="60" w:before="60" w:line="320" w:lineRule="auto"/>
+        <w:jc w:val="both"/>
+      </w:pPr>
+      <w:r>
+        <w:rPr>
+          <w:rFonts w:ascii="Calibri" w:cs="Calibri" w:eastAsia="Calibri" w:hAnsi="Calibri"/>
+          <w:b w:val="false"/>
+          <w:bCs w:val="false"/>
+          <w:sz w:val="22"/>
+          <w:szCs w:val="22"/>
+        </w:rPr>
+        <w:t xml:space="preserve">(2) The draw is fully random; there are no seeds and no preferential treatment based on registration order or video score. The only exception is that, if the total number N of teams is not a power of 2, the draw also determines which bracket positions receive a first-round bye, and the bye teams advance directly to the next round. A first-round bye merely gives the team a walk-over in the first round; it carries the same advancement rights in the bracket as a team that wins its first-round match, and the team plays normally in subsequent rounds. If a bye team is eliminated in the first round it actually plays, its final ranking is determined per §6.4(1) on a par with the other teams eliminated in that round.</w:t>
       </w:r>
     </w:p>
     <w:p>
@@ -3927,7 +3959,7 @@
           <w:sz w:val="25"/>
           <w:szCs w:val="25"/>
         </w:rPr>
-        <w:t xml:space="preserve">10.6.2 Single-Elimination Knockout</w:t>
+        <w:t xml:space="preserve">6.2 Single-Elimination Knockout</w:t>
       </w:r>
     </w:p>
     <w:p>
@@ -3959,7 +3991,7 @@
           <w:sz w:val="22"/>
           <w:szCs w:val="22"/>
         </w:rPr>
-        <w:t xml:space="preserve">(2) The bracket positions of each round strictly follow the draw of §10.6.1; the winner of one round advances to the next round along the path already specified in the bracket. There is no re-draw.</w:t>
+        <w:t xml:space="preserve">(2) The bracket positions of each round strictly follow the draw of §6.1; the winner of one round advances to the next round along the path already specified in the bracket. There is no re-draw.</w:t>
       </w:r>
     </w:p>
     <w:p>
@@ -4008,23 +4040,23 @@
           <w:sz w:val="25"/>
           <w:szCs w:val="25"/>
         </w:rPr>
-        <w:t xml:space="preserve">10.6.3 Per-Match Result and Advancement</w:t>
-      </w:r>
-    </w:p>
-    <w:p>
-      <w:pPr>
-        <w:spacing w:after="60" w:before="60" w:line="320" w:lineRule="auto"/>
-        <w:jc w:val="both"/>
-      </w:pPr>
-      <w:r>
-        <w:rPr>
-          <w:rFonts w:ascii="Calibri" w:cs="Calibri" w:eastAsia="Calibri" w:hAnsi="Calibri"/>
-          <w:b w:val="false"/>
-          <w:bCs w:val="false"/>
-          <w:sz w:val="22"/>
-          <w:szCs w:val="22"/>
-        </w:rPr>
-        <w:t xml:space="preserve">(1) The result of each robot-vs-robot match is determined by the best-of-5 format and scoring rules in §10.5.1.</w:t>
+        <w:t xml:space="preserve">6.3 Per-Match Result and Advancement</w:t>
+      </w:r>
+    </w:p>
+    <w:p>
+      <w:pPr>
+        <w:spacing w:after="60" w:before="60" w:line="320" w:lineRule="auto"/>
+        <w:jc w:val="both"/>
+      </w:pPr>
+      <w:r>
+        <w:rPr>
+          <w:rFonts w:ascii="Calibri" w:cs="Calibri" w:eastAsia="Calibri" w:hAnsi="Calibri"/>
+          <w:b w:val="false"/>
+          <w:bCs w:val="false"/>
+          <w:sz w:val="22"/>
+          <w:szCs w:val="22"/>
+        </w:rPr>
+        <w:t xml:space="preserve">(1) The result of each robot-vs-robot match is determined by the best-of-5 format and scoring rules in §5.1.</w:t>
       </w:r>
     </w:p>
     <w:p>
@@ -4057,7 +4089,7 @@
           <w:sz w:val="25"/>
           <w:szCs w:val="25"/>
         </w:rPr>
-        <w:t xml:space="preserve">10.6.4 Final Ranking</w:t>
+        <w:t xml:space="preserve">6.4 Final Ranking</w:t>
       </w:r>
     </w:p>
     <w:p>
@@ -4089,7 +4121,7 @@
           <w:sz w:val="22"/>
           <w:szCs w:val="22"/>
         </w:rPr>
-        <w:t xml:space="preserve">(2) The Robot Champion (the winner of the final) represents the event in the robot-vs-human exhibition match described in §10.7.</w:t>
+        <w:t xml:space="preserve">(2) The Robot Champion (the winner of the final) represents the event in the robot-vs-human exhibition match described in §7.</w:t>
       </w:r>
     </w:p>
     <w:p>
@@ -4122,23 +4154,23 @@
           <w:sz w:val="28"/>
           <w:szCs w:val="28"/>
         </w:rPr>
-        <w:t xml:space="preserve">10.7 Robot Champion vs. Human Professional Player Exhibition Match</w:t>
-      </w:r>
-    </w:p>
-    <w:p>
-      <w:pPr>
-        <w:spacing w:after="60" w:before="60" w:line="320" w:lineRule="auto"/>
-        <w:jc w:val="both"/>
-      </w:pPr>
-      <w:r>
-        <w:rPr>
-          <w:rFonts w:ascii="Calibri" w:cs="Calibri" w:eastAsia="Calibri" w:hAnsi="Calibri"/>
-          <w:b w:val="false"/>
-          <w:bCs w:val="false"/>
-          <w:sz w:val="22"/>
-          <w:szCs w:val="22"/>
-        </w:rPr>
-        <w:t xml:space="preserve">To promote humanoid-robot table tennis and to demonstrate the current level of the robots in an accessible way, after each robot-vs-robot competition this event holds an exhibition match between the Robot Champion and a human professional table-tennis player. The rules of the exhibition match are kept highly compatible with the robot-vs-robot rules of this chapter (subject to the robot requirements in §10.2 and the special clauses in this section), so that the same robot can take part with no modifications.</w:t>
+        <w:t xml:space="preserve">7 Robot Champion vs. Human Professional Player Exhibition Match</w:t>
+      </w:r>
+    </w:p>
+    <w:p>
+      <w:pPr>
+        <w:spacing w:after="60" w:before="60" w:line="320" w:lineRule="auto"/>
+        <w:jc w:val="both"/>
+      </w:pPr>
+      <w:r>
+        <w:rPr>
+          <w:rFonts w:ascii="Calibri" w:cs="Calibri" w:eastAsia="Calibri" w:hAnsi="Calibri"/>
+          <w:b w:val="false"/>
+          <w:bCs w:val="false"/>
+          <w:sz w:val="22"/>
+          <w:szCs w:val="22"/>
+        </w:rPr>
+        <w:t xml:space="preserve">To promote humanoid-robot table tennis and to demonstrate the current level of the robots in an accessible way, after each robot-vs-robot competition this event holds an exhibition match between the Robot Champion and a human professional table-tennis player. The rules of the exhibition match are kept highly compatible with the robot-vs-robot rules of this chapter (subject to the robot requirements in §2 and the special clauses in this section), so that the same robot can take part with no modifications.</w:t>
       </w:r>
     </w:p>
     <w:p>
@@ -4155,23 +4187,23 @@
           <w:sz w:val="25"/>
           <w:szCs w:val="25"/>
         </w:rPr>
-        <w:t xml:space="preserve">10.7.1 Participants</w:t>
-      </w:r>
-    </w:p>
-    <w:p>
-      <w:pPr>
-        <w:spacing w:after="60" w:before="60" w:line="320" w:lineRule="auto"/>
-        <w:jc w:val="both"/>
-      </w:pPr>
-      <w:r>
-        <w:rPr>
-          <w:rFonts w:ascii="Calibri" w:cs="Calibri" w:eastAsia="Calibri" w:hAnsi="Calibri"/>
-          <w:b w:val="false"/>
-          <w:bCs w:val="false"/>
-          <w:sz w:val="22"/>
-          <w:szCs w:val="22"/>
-        </w:rPr>
-        <w:t xml:space="preserve">(1) Robot side. The Robot Champion team determined in §10.6 enters the exhibition match. Before the exhibition match begins, the Robot Champion must pass the same safety inspection and system-integration test as in the robot-vs-robot competition; all robot requirements in §10.2 continue to apply.</w:t>
+        <w:t xml:space="preserve">7.1 Participants</w:t>
+      </w:r>
+    </w:p>
+    <w:p>
+      <w:pPr>
+        <w:spacing w:after="60" w:before="60" w:line="320" w:lineRule="auto"/>
+        <w:jc w:val="both"/>
+      </w:pPr>
+      <w:r>
+        <w:rPr>
+          <w:rFonts w:ascii="Calibri" w:cs="Calibri" w:eastAsia="Calibri" w:hAnsi="Calibri"/>
+          <w:b w:val="false"/>
+          <w:bCs w:val="false"/>
+          <w:sz w:val="22"/>
+          <w:szCs w:val="22"/>
+        </w:rPr>
+        <w:t xml:space="preserve">(1) Robot side. The Robot Champion team determined in §6 enters the exhibition match. Before the exhibition match begins, the Robot Champion must pass the same safety inspection and system-integration test as in the robot-vs-robot competition; all robot requirements in §2 continue to apply.</w:t>
       </w:r>
     </w:p>
     <w:p>
@@ -4220,7 +4252,7 @@
           <w:sz w:val="25"/>
           <w:szCs w:val="25"/>
         </w:rPr>
-        <w:t xml:space="preserve">10.7.2 Match Format</w:t>
+        <w:t xml:space="preserve">7.2 Match Format</w:t>
       </w:r>
     </w:p>
     <w:p>
@@ -4252,7 +4284,7 @@
           <w:sz w:val="22"/>
           <w:szCs w:val="22"/>
         </w:rPr>
-        <w:t xml:space="preserve">(2) Service. Before the match the umpire on duty performs a coin toss to determine the right of service and the choice of ends. Other service and rotation rules follow ITTF and §10.5.2 of this chapter.</w:t>
+        <w:t xml:space="preserve">(2) Service. Before the match the umpire on duty performs a coin toss to determine the right of service and the choice of ends. Other service and rotation rules follow ITTF and §5.2 of this chapter.</w:t>
       </w:r>
     </w:p>
     <w:p>
@@ -4301,7 +4333,7 @@
           <w:sz w:val="25"/>
           <w:szCs w:val="25"/>
         </w:rPr>
-        <w:t xml:space="preserve">10.7.3 Common Rules and Differentiated Adaptations</w:t>
+        <w:t xml:space="preserve">7.3 Common Rules and Differentiated Adaptations</w:t>
       </w:r>
     </w:p>
     <w:p>
@@ -4333,23 +4365,23 @@
           <w:sz w:val="22"/>
           <w:szCs w:val="22"/>
         </w:rPr>
-        <w:t xml:space="preserve">(1) Service stance. When the robot serves, the rules of §10.5.2 apply. When the human player serves, ITTF §2.6 applies. A service fault by either side loses 1 point under the ITTF rule.</w:t>
-      </w:r>
-    </w:p>
-    <w:p>
-      <w:pPr>
-        <w:spacing w:after="60" w:before="60" w:line="320" w:lineRule="auto"/>
-        <w:jc w:val="both"/>
-      </w:pPr>
-      <w:r>
-        <w:rPr>
-          <w:rFonts w:ascii="Calibri" w:cs="Calibri" w:eastAsia="Calibri" w:hAnsi="Calibri"/>
-          <w:b w:val="false"/>
-          <w:bCs w:val="false"/>
-          <w:sz w:val="22"/>
-          <w:szCs w:val="22"/>
-        </w:rPr>
-        <w:t xml:space="preserve">(2) Good return. Both sides have their returns judged under ITTF §2.7. The human player may, without affecting the robot's service or umpire's decisions, move normally to any side of the table. The robot side remains subject to §10.5.3 of this chapter (must not cross the centerline, must not touch the net assembly or its own half-table). The human player is judged under ITTF §2.10.1.10, which forbids only the body or carried items touching the opponent's half-table — touching the player's own half is allowed. The robot side is judged under the stricter §10.5.3(4) of this chapter.</w:t>
+        <w:t xml:space="preserve">(1) Service stance. When the robot serves, the rules of §5.2 apply. When the human player serves, ITTF §2.6 applies. A service fault by either side loses 1 point under the ITTF rule.</w:t>
+      </w:r>
+    </w:p>
+    <w:p>
+      <w:pPr>
+        <w:spacing w:after="60" w:before="60" w:line="320" w:lineRule="auto"/>
+        <w:jc w:val="both"/>
+      </w:pPr>
+      <w:r>
+        <w:rPr>
+          <w:rFonts w:ascii="Calibri" w:cs="Calibri" w:eastAsia="Calibri" w:hAnsi="Calibri"/>
+          <w:b w:val="false"/>
+          <w:bCs w:val="false"/>
+          <w:sz w:val="22"/>
+          <w:szCs w:val="22"/>
+        </w:rPr>
+        <w:t xml:space="preserve">(2) Good return. Both sides have their returns judged under ITTF §2.7. The human player may, without affecting the robot's service or umpire's decisions, move normally to any side of the table. The robot side remains subject to §5.3 of this chapter (must not cross the centerline, must not touch the net assembly or its own half-table). The human player is judged under ITTF §2.10.1.10, which forbids only the body or carried items touching the opponent's half-table — touching the player's own half is allowed. The robot side is judged under the stricter §5.3(4) of this chapter.</w:t>
       </w:r>
     </w:p>
     <w:p>
@@ -4397,7 +4429,7 @@
           <w:sz w:val="22"/>
           <w:szCs w:val="22"/>
         </w:rPr>
-        <w:t xml:space="preserve">(5) Emergency stop. The emergency-stop response in the exhibition match follows the unified rule in §10.5.5(9) (the human player is NOT responsible for issuing the emergency-stop command). If the human player notices an anomaly in the robot or otherwise needs to suspend play, the human player shall signal the chief umpire by raising a hand, calling out, or other clear signals; upon the umpire's whistle, the on-court team members must promptly press the emergency-stop button of their own robot.</w:t>
+        <w:t xml:space="preserve">(5) Emergency stop. The emergency-stop response in the exhibition match follows the unified rule in §5.5(9) (the human player is NOT responsible for issuing the emergency-stop command). If the human player notices an anomaly in the robot or otherwise needs to suspend play, the human player shall signal the chief umpire by raising a hand, calling out, or other clear signals; upon the umpire's whistle, the on-court team members must promptly press the emergency-stop button of their own robot.</w:t>
       </w:r>
     </w:p>
     <w:p>
@@ -4414,7 +4446,7 @@
           <w:sz w:val="25"/>
           <w:szCs w:val="25"/>
         </w:rPr>
-        <w:t xml:space="preserve">10.7.4 Safety and On-Site Handling (Special Clauses for the Robot-vs-Human Exhibition Match)</w:t>
+        <w:t xml:space="preserve">7.4 Safety and On-Site Handling (Special Clauses for the Robot-vs-Human Exhibition Match)</w:t>
       </w:r>
     </w:p>
     <w:p>
@@ -4446,23 +4478,23 @@
           <w:sz w:val="22"/>
           <w:szCs w:val="22"/>
         </w:rPr>
-        <w:t xml:space="preserve">(1) Pre-match safety check. 60 minutes before the exhibition match, a safety referee designated by the Organizing Committee inspects the robot's exterior, the maximum output torque and other key safety indicators (the emergency-stop response is tested uniformly during the standard pre-match preparation time per §10.5.5(9)). The peak resultant linear velocity at the robot's racket-grip location (the interface between the racket and the robot's hand) shall not exceed 6 m/s. Measurement method: the Organizing Committee affixes a smart IMU (Inertial Measurement Unit) to the robot's racket-holding wrist or grip and records the peak resultant linear velocity, via the companion IMU application, while the robot performs a pre-agreed maximum-swing motion repeated several times. A robot that fails this test is not permitted to participate in the exhibition match.</w:t>
-      </w:r>
-    </w:p>
-    <w:p>
-      <w:pPr>
-        <w:spacing w:after="60" w:before="60" w:line="320" w:lineRule="auto"/>
-        <w:jc w:val="both"/>
-      </w:pPr>
-      <w:r>
-        <w:rPr>
-          <w:rFonts w:ascii="Calibri" w:cs="Calibri" w:eastAsia="Calibri" w:hAnsi="Calibri"/>
-          <w:b w:val="false"/>
-          <w:bCs w:val="false"/>
-          <w:sz w:val="22"/>
-          <w:szCs w:val="22"/>
-        </w:rPr>
-        <w:t xml:space="preserve">(2) Human-player safety equipment. The Organizing Committee provides competition-grade protective eyewear for the human player. The human player is NOT responsible for issuing the emergency-stop command; upon noticing any anomaly of the robot or otherwise needing to suspend play, the human player shall signal the chief umpire (by raising a hand, calling out, or similar clear signal). The subsequent emergency-stop procedure is per §10.7.3(5) and §10.5.5(9).</w:t>
+        <w:t xml:space="preserve">(1) Pre-match safety check. 60 minutes before the exhibition match, a safety referee designated by the Organizing Committee inspects the robot's exterior, the maximum output torque and other key safety indicators (the emergency-stop response is tested uniformly during the standard pre-match preparation time per §5.5(9)). The peak resultant linear velocity at the robot's racket-grip location (the interface between the racket and the robot's hand) shall not exceed 6 m/s. Measurement method: the Organizing Committee affixes a smart IMU (Inertial Measurement Unit) to the robot's racket-holding wrist or grip and records the peak resultant linear velocity, via the companion IMU application, while the robot performs a pre-agreed maximum-swing motion repeated several times. A robot that fails this test is not permitted to participate in the exhibition match.</w:t>
+      </w:r>
+    </w:p>
+    <w:p>
+      <w:pPr>
+        <w:spacing w:after="60" w:before="60" w:line="320" w:lineRule="auto"/>
+        <w:jc w:val="both"/>
+      </w:pPr>
+      <w:r>
+        <w:rPr>
+          <w:rFonts w:ascii="Calibri" w:cs="Calibri" w:eastAsia="Calibri" w:hAnsi="Calibri"/>
+          <w:b w:val="false"/>
+          <w:bCs w:val="false"/>
+          <w:sz w:val="22"/>
+          <w:szCs w:val="22"/>
+        </w:rPr>
+        <w:t xml:space="preserve">(2) Human-player safety equipment. The Organizing Committee provides competition-grade protective eyewear for the human player. The human player is NOT responsible for issuing the emergency-stop command; upon noticing any anomaly of the robot or otherwise needing to suspend play, the human player shall signal the chief umpire (by raising a hand, calling out, or similar clear signal). The subsequent emergency-stop procedure is per §7.3(5) and §5.5(9).</w:t>
       </w:r>
     </w:p>
     <w:p>
@@ -4526,39 +4558,39 @@
           <w:sz w:val="22"/>
           <w:szCs w:val="22"/>
         </w:rPr>
-        <w:t xml:space="preserve">(6) Handling of a fallen robot and the stacked penalty follow §10.5.5(2)–(5). If the situation reaches the "three-consecutive-rally" threshold of §10.5.5(4), the exhibition match is terminated immediately and the Robot Champion is deemed to have forfeited the match.</w:t>
-      </w:r>
-    </w:p>
-    <w:p>
-      <w:pPr>
-        <w:spacing w:after="60" w:before="60" w:line="320" w:lineRule="auto"/>
-        <w:jc w:val="both"/>
-      </w:pPr>
-      <w:r>
-        <w:rPr>
-          <w:rFonts w:ascii="Calibri" w:cs="Calibri" w:eastAsia="Calibri" w:hAnsi="Calibri"/>
-          <w:b w:val="false"/>
-          <w:bCs w:val="false"/>
-          <w:sz w:val="22"/>
-          <w:szCs w:val="22"/>
-        </w:rPr>
-        <w:t xml:space="preserve">(7) The human player is not subject to this section or to §10.5.5 fall-handling rules. If the human player falls, has health issues or actively asks to pause, the situation is handled under the emergency procedure of clause (5) of this section.</w:t>
-      </w:r>
-    </w:p>
-    <w:p>
-      <w:pPr>
-        <w:spacing w:after="60" w:before="60" w:line="320" w:lineRule="auto"/>
-        <w:jc w:val="both"/>
-      </w:pPr>
-      <w:r>
-        <w:rPr>
-          <w:rFonts w:ascii="Calibri" w:cs="Calibri" w:eastAsia="Calibri" w:hAnsi="Calibri"/>
-          <w:b w:val="false"/>
-          <w:bCs w:val="false"/>
-          <w:sz w:val="22"/>
-          <w:szCs w:val="22"/>
-        </w:rPr>
-        <w:t xml:space="preserve">(8) Safety-device integration test. All safety devices that protect the robot and the human player (the robot's emergency-stop button, the virtual safety wall and its ROS 2 real-time monitoring node) must be integration-tested 60 minutes before the exhibition match by the Organizing Committee's safety referee jointly with the Robot Champion side. Failure of any device cancels the exhibition match. The objective measurement of the emergency-stop response time is conducted uniformly during the standard pre-match preparation time per §10.5.5(9).</w:t>
+        <w:t xml:space="preserve">(6) Handling of a fallen robot and the stacked penalty follow §5.5(2)–(5). If the situation reaches the "three-consecutive-rally" threshold of §5.5(4), the exhibition match is terminated immediately and the Robot Champion is deemed to have forfeited the match.</w:t>
+      </w:r>
+    </w:p>
+    <w:p>
+      <w:pPr>
+        <w:spacing w:after="60" w:before="60" w:line="320" w:lineRule="auto"/>
+        <w:jc w:val="both"/>
+      </w:pPr>
+      <w:r>
+        <w:rPr>
+          <w:rFonts w:ascii="Calibri" w:cs="Calibri" w:eastAsia="Calibri" w:hAnsi="Calibri"/>
+          <w:b w:val="false"/>
+          <w:bCs w:val="false"/>
+          <w:sz w:val="22"/>
+          <w:szCs w:val="22"/>
+        </w:rPr>
+        <w:t xml:space="preserve">(7) The human player is not subject to this section or to §5.5 fall-handling rules. If the human player falls, has health issues or actively asks to pause, the situation is handled under the emergency procedure of clause (5) of this section.</w:t>
+      </w:r>
+    </w:p>
+    <w:p>
+      <w:pPr>
+        <w:spacing w:after="60" w:before="60" w:line="320" w:lineRule="auto"/>
+        <w:jc w:val="both"/>
+      </w:pPr>
+      <w:r>
+        <w:rPr>
+          <w:rFonts w:ascii="Calibri" w:cs="Calibri" w:eastAsia="Calibri" w:hAnsi="Calibri"/>
+          <w:b w:val="false"/>
+          <w:bCs w:val="false"/>
+          <w:sz w:val="22"/>
+          <w:szCs w:val="22"/>
+        </w:rPr>
+        <w:t xml:space="preserve">(8) Safety-device integration test. All safety devices that protect the robot and the human player (the robot's emergency-stop button, the virtual safety wall and its ROS 2 real-time monitoring node) must be integration-tested 60 minutes before the exhibition match by the Organizing Committee's safety referee jointly with the Robot Champion side. Failure of any device cancels the exhibition match. The objective measurement of the emergency-stop response time is conducted uniformly during the standard pre-match preparation time per §5.5(9).</w:t>
       </w:r>
     </w:p>
     <w:p>
@@ -4575,23 +4607,23 @@
           <w:sz w:val="25"/>
           <w:szCs w:val="25"/>
         </w:rPr>
-        <w:t xml:space="preserve">10.7.5 Communication and System Integration (for the Robot-vs-Human Exhibition Match)</w:t>
-      </w:r>
-    </w:p>
-    <w:p>
-      <w:pPr>
-        <w:spacing w:after="60" w:before="60" w:line="320" w:lineRule="auto"/>
-        <w:jc w:val="both"/>
-      </w:pPr>
-      <w:r>
-        <w:rPr>
-          <w:rFonts w:ascii="Calibri" w:cs="Calibri" w:eastAsia="Calibri" w:hAnsi="Calibri"/>
-          <w:b w:val="false"/>
-          <w:bCs w:val="false"/>
-          <w:sz w:val="22"/>
-          <w:szCs w:val="22"/>
-        </w:rPr>
-        <w:t xml:space="preserve">(1) The interface requirements between the exhibition match and the HOPE Standard Motion-Capture System are identical to those of §10.5.4. The Robot Champion must subscribe, via the network provided by the Organizing Committee, to the standard ROS 2 topics defined in the HOPE GitHub Repository. Match-state commands are still issued by the umpire to the team members, translated by the team members' computer and forwarded to the robot; the Organizing Committee does not send any state or racket-target command to the robot directly.</w:t>
+        <w:t xml:space="preserve">7.5 Communication and System Integration (for the Robot-vs-Human Exhibition Match)</w:t>
+      </w:r>
+    </w:p>
+    <w:p>
+      <w:pPr>
+        <w:spacing w:after="60" w:before="60" w:line="320" w:lineRule="auto"/>
+        <w:jc w:val="both"/>
+      </w:pPr>
+      <w:r>
+        <w:rPr>
+          <w:rFonts w:ascii="Calibri" w:cs="Calibri" w:eastAsia="Calibri" w:hAnsi="Calibri"/>
+          <w:b w:val="false"/>
+          <w:bCs w:val="false"/>
+          <w:sz w:val="22"/>
+          <w:szCs w:val="22"/>
+        </w:rPr>
+        <w:t xml:space="preserve">(1) The interface requirements between the exhibition match and the HOPE Standard Motion-Capture System are identical to those of §5.4. The Robot Champion must subscribe, via the network provided by the Organizing Committee, to the standard ROS 2 topics defined in the HOPE GitHub Repository. Match-state commands are still issued by the umpire to the team members, translated by the team members' computer and forwarded to the robot; the Organizing Committee does not send any state or racket-target command to the robot directly.</w:t>
       </w:r>
     </w:p>
     <w:p>
@@ -4639,7 +4671,7 @@
           <w:sz w:val="22"/>
           <w:szCs w:val="22"/>
         </w:rPr>
-        <w:t xml:space="preserve">(4) 30 minutes before the exhibition match, the Organizing Committee and the Robot Champion side jointly perform an on-site integration test of the motion-capture system and the refereeing machine; failure of any test cancels the exhibition match. The safety-device integration test (emergency-stop button, virtual safety wall, etc.) is conducted 60 minutes before the match per §10.7.4(8); the emergency-stop response time test is conducted uniformly during the standard pre-match preparation time per §10.5.5(9).</w:t>
+        <w:t xml:space="preserve">(4) 30 minutes before the exhibition match, the Organizing Committee and the Robot Champion side jointly perform an on-site integration test of the motion-capture system and the refereeing machine; failure of any test cancels the exhibition match. The safety-device integration test (emergency-stop button, virtual safety wall, etc.) is conducted 60 minutes before the match per §7.4(8); the emergency-stop response time test is conducted uniformly during the standard pre-match preparation time per §5.5(9).</w:t>
       </w:r>
     </w:p>
     <w:p>
@@ -4656,7 +4688,7 @@
           <w:sz w:val="25"/>
           <w:szCs w:val="25"/>
         </w:rPr>
-        <w:t xml:space="preserve">10.7.6 Exhibition-Match Result and Disclosure</w:t>
+        <w:t xml:space="preserve">7.6 Exhibition-Match Result and Disclosure</w:t>
       </w:r>
     </w:p>
     <w:p>
@@ -4721,7 +4753,7 @@
           <w:sz w:val="28"/>
           <w:szCs w:val="28"/>
         </w:rPr>
-        <w:t xml:space="preserve">10.8 On the Acronym and the Initiating Organizations</w:t>
+        <w:t xml:space="preserve">8 On the Acronym and the Initiating Organizations</w:t>
       </w:r>
     </w:p>
     <w:p>
@@ -4802,7 +4834,7 @@
           <w:sz w:val="28"/>
           <w:szCs w:val="28"/>
         </w:rPr>
-        <w:t xml:space="preserve">10.9 Supplementary Provisions</w:t>
+        <w:t xml:space="preserve">9 Supplementary Provisions</w:t>
       </w:r>
     </w:p>
     <w:p>
@@ -4834,7 +4866,7 @@
           <w:sz w:val="22"/>
           <w:szCs w:val="22"/>
         </w:rPr>
-        <w:t xml:space="preserve">(2) This event adopts Open Registration. Every team that meets the requirements of §10.1 and submits a passing qualification video by 31 July is eligible to participate. The Event Committee reserves the right to adjust the bracket structure according to the scale of registration.</w:t>
+        <w:t xml:space="preserve">(2) This event adopts Open Registration. Every team that meets the requirements of §1 and submits a passing qualification video by 31 July is eligible to participate. The Event Committee reserves the right to adjust the bracket structure according to the scale of registration.</w:t>
       </w:r>
     </w:p>
     <w:p>
@@ -4882,7 +4914,7 @@
           <w:sz w:val="22"/>
           <w:szCs w:val="22"/>
         </w:rPr>
-        <w:t xml:space="preserve">(5) The participating team retains full intellectual-property rights and confidentiality over its robot's internal technical solution. The Organizing Committee undertakes not to require, publish or disclose any materials concerning the robot's software, hardware, control algorithm, training data or model weights other than the registration information described in §10.1.</w:t>
+        <w:t xml:space="preserve">(5) The participating team retains full intellectual-property rights and confidentiality over its robot's internal technical solution. The Organizing Committee undertakes not to require, publish or disclose any materials concerning the robot's software, hardware, control algorithm, training data or model weights other than the registration information described in §1.</w:t>
       </w:r>
     </w:p>
     <w:sectPr>
@@ -5037,7 +5069,7 @@
         <w:sz w:val="20"/>
         <w:szCs w:val="20"/>
       </w:rPr>
-      <w:t xml:space="preserve">2nd World Humanoid Robot Games — HOPE AI Challenge Rule Chapter</w:t>
+      <w:t xml:space="preserve">2nd World Humanoid Robot Games — Hitch Open Ping-Pong Embodied (HOPE) AI Challenge Rulebook</w:t>
     </w:r>
   </w:p>
 </w:hdr>

</xml_diff>